<commit_message>
Spurious spaces and missing spaces
</commit_message>
<xml_diff>
--- a/Consolidated N15-N20.docx
+++ b/Consolidated N15-N20.docx
@@ -1453,7 +1453,6 @@
       <w:r>
         <w:t xml:space="preserve">, </w:t>
       </w:r>
-      <w:proofErr w:type="gramStart"/>
       <w:r>
         <w:rPr>
           <w:i/>
@@ -1469,9 +1468,8 @@
           <w:i/>
           <w:iCs/>
         </w:rPr>
-        <w:t> resolution</w:t>
-      </w:r>
-      <w:proofErr w:type="gramEnd"/>
+        <w:t>resolution</w:t>
+      </w:r>
       <w:r>
         <w:t xml:space="preserve">, and </w:t>
       </w:r>
@@ -2091,21 +2089,7 @@
         <w:rPr>
           <w:rFonts w:eastAsia="Times New Roman"/>
         </w:rPr>
-        <w:t xml:space="preserve">During the commenting phase, Representatives shall read the CR and any preliminary recommendations of the CCA. </w:t>
-      </w:r>
-      <w:proofErr w:type="gramStart"/>
-      <w:r>
-        <w:rPr>
-          <w:rFonts w:eastAsia="Times New Roman"/>
-        </w:rPr>
-        <w:t>The  Representatives</w:t>
-      </w:r>
-      <w:proofErr w:type="gramEnd"/>
-      <w:r>
-        <w:rPr>
-          <w:rFonts w:eastAsia="Times New Roman"/>
-        </w:rPr>
-        <w:t xml:space="preserve"> may prepare written comments that are circulated within the MA but are not made public.</w:t>
+        <w:t>During the commenting phase, Representatives shall read the CR and any preliminary recommendations of the CCA. The Representatives may prepare written comments that are circulated within the MA but are not made public.</w:t>
       </w:r>
     </w:p>
     <w:p>
@@ -2634,15 +2618,13 @@
         <w:pStyle w:val="NormalWeb"/>
       </w:pPr>
       <w:r>
-        <w:t xml:space="preserve">Preparation and publication of all documentation for the UCS character repertoire is delegated to the </w:t>
-      </w:r>
-      <w:proofErr w:type="gramStart"/>
-      <w:r>
-        <w:t>IA(</w:t>
-      </w:r>
-      <w:proofErr w:type="gramEnd"/>
-      <w:r>
-        <w:t xml:space="preserve">see 2.3). The IA shall implement all accepted modifications in the published code charts and data files that document the UCS repertoire. </w:t>
+        <w:t>Preparation and publication of all documentation for the UCS character repertoire is delegated to the IA</w:t>
+      </w:r>
+      <w:r>
+        <w:t xml:space="preserve"> </w:t>
+      </w:r>
+      <w:r>
+        <w:t xml:space="preserve">(see 2.3). The IA shall implement all accepted modifications in the published code charts and data files that document the UCS repertoire. </w:t>
       </w:r>
     </w:p>
     <w:p>

</xml_diff>

<commit_message>
Change 5.4.2 and 5.4.1 NOTE 4 to address N 27 item 2.1
</commit_message>
<xml_diff>
--- a/Consolidated N15-N20.docx
+++ b/Consolidated N15-N20.docx
@@ -42,9 +42,48 @@
     <w:p>
       <w:pPr>
         <w:pStyle w:val="NormalWeb"/>
-      </w:pPr>
-      <w:r>
-        <w:t>[Consolidated N 15 + N 20]</w:t>
+        <w:jc w:val="left"/>
+      </w:pPr>
+      <w:r>
+        <w:t>[Consolidated N 15 + N 20</w:t>
+      </w:r>
+      <w:ins w:id="0" w:author="Robin Leroy" w:date="2026-05-14T21:47:00Z" w16du:dateUtc="2026-05-14T19:47:00Z">
+        <w:r>
+          <w:br/>
+        </w:r>
+      </w:ins>
+      <w:ins w:id="1" w:author="Robin Leroy" w:date="2026-05-14T21:46:00Z" w16du:dateUtc="2026-05-14T19:46:00Z">
+        <w:r>
+          <w:t>+ changes</w:t>
+        </w:r>
+      </w:ins>
+      <w:ins w:id="2" w:author="Robin Leroy" w:date="2026-05-14T21:45:00Z" w16du:dateUtc="2026-05-14T19:45:00Z">
+        <w:r>
+          <w:t xml:space="preserve"> to 5.4.2 and</w:t>
+        </w:r>
+      </w:ins>
+      <w:ins w:id="3" w:author="Robin Leroy" w:date="2026-05-14T21:48:00Z" w16du:dateUtc="2026-05-14T19:48:00Z">
+        <w:r>
+          <w:t xml:space="preserve"> to NOTE 4</w:t>
+        </w:r>
+      </w:ins>
+      <w:ins w:id="4" w:author="Robin Leroy" w:date="2026-05-14T21:45:00Z" w16du:dateUtc="2026-05-14T19:45:00Z">
+        <w:r>
+          <w:t xml:space="preserve"> in </w:t>
+        </w:r>
+      </w:ins>
+      <w:ins w:id="5" w:author="Robin Leroy" w:date="2026-05-14T21:46:00Z" w16du:dateUtc="2026-05-14T19:46:00Z">
+        <w:r>
+          <w:t>5.4.1 to</w:t>
+        </w:r>
+      </w:ins>
+      <w:ins w:id="6" w:author="Robin Leroy" w:date="2026-05-14T21:45:00Z" w16du:dateUtc="2026-05-14T19:45:00Z">
+        <w:r>
+          <w:t xml:space="preserve"> address N 27 item 2.1</w:t>
+        </w:r>
+      </w:ins>
+      <w:r>
+        <w:t>]</w:t>
       </w:r>
     </w:p>
     <w:p>
@@ -2185,7 +2224,13 @@
         <w:pStyle w:val="Heading2"/>
       </w:pPr>
       <w:r>
-        <w:t>5.4 Resolution phase</w:t>
+        <w:t>5.4</w:t>
+      </w:r>
+      <w:r>
+        <w:t>.</w:t>
+      </w:r>
+      <w:r>
+        <w:t xml:space="preserve"> Resolution phase</w:t>
       </w:r>
     </w:p>
     <w:p>
@@ -2420,8 +2465,18 @@
       </w:r>
       <w:r>
         <w:tab/>
-        <w:t>Consensus is defined by ISO/IEC Guide 2:2004, entry 1.7, and the ISO Directives, part 1, subclause 2.5.6.</w:t>
-      </w:r>
+        <w:t>Consensus is defined by ISO/IEC Guide 2:2004, entry 1.7, and the ISO Directives, part 1, subclause 2.5.6</w:t>
+      </w:r>
+      <w:del w:id="7" w:author="Robin Leroy" w:date="2026-05-14T21:43:00Z" w16du:dateUtc="2026-05-14T19:43:00Z">
+        <w:r>
+          <w:delText>.</w:delText>
+        </w:r>
+      </w:del>
+      <w:ins w:id="8" w:author="Robin Leroy" w:date="2026-05-14T21:43:00Z" w16du:dateUtc="2026-05-14T19:43:00Z">
+        <w:r>
+          <w:t>, together with subclause 5.4.2 of this document.</w:t>
+        </w:r>
+      </w:ins>
     </w:p>
     <w:p>
       <w:pPr>
@@ -2430,6 +2485,18 @@
       <w:r>
         <w:t>5.4.2 Decision process</w:t>
       </w:r>
+    </w:p>
+    <w:p>
+      <w:pPr>
+        <w:rPr>
+          <w:ins w:id="9" w:author="Robin Leroy" w:date="2026-05-14T21:42:00Z" w16du:dateUtc="2026-05-14T19:42:00Z"/>
+        </w:rPr>
+      </w:pPr>
+      <w:ins w:id="10" w:author="Robin Leroy" w:date="2026-05-14T21:42:00Z" w16du:dateUtc="2026-05-14T19:42:00Z">
+        <w:r>
+          <w:t>For the purposes of determining consensus of the Voting Group, objections from IA Representatives shall only be considered sustained oppositions if they are expressed by the Primary Representative of the IA.</w:t>
+        </w:r>
+      </w:ins>
     </w:p>
     <w:p>
       <w:r>
@@ -2514,6 +2581,7 @@
         </w:numPr>
       </w:pPr>
       <w:r>
+        <w:lastRenderedPageBreak/>
         <w:t>The Primary Representative of the IA communicates that the position of the IA is in favour of the Decision.</w:t>
       </w:r>
     </w:p>
@@ -2525,7 +2593,6 @@
         </w:numPr>
       </w:pPr>
       <w:r>
-        <w:lastRenderedPageBreak/>
         <w:t>Two-thirds of the votes from P-member Representatives, excluding abstentions, are in favour of the Decision.</w:t>
       </w:r>
     </w:p>
@@ -2692,11 +2759,8 @@
         <w:pStyle w:val="NormalWeb"/>
       </w:pPr>
       <w:r>
-        <w:t xml:space="preserve">If a CCA raises such a concern but there is no consensus within the Voting Group that the concern requires special input from SC 2, the CCA may advise the Voting Group that it intends to publicly document the concern and the MA decision regarding that concern. (The CCA could </w:t>
-      </w:r>
-      <w:r>
         <w:lastRenderedPageBreak/>
-        <w:t>consider this necessary, for instance, to avoid reputational harm.) If still there is no consensus within the Voting Group to engage SC 2 on the concern, progression of the CR under normal MA procedures shall resume.</w:t>
+        <w:t>If a CCA raises such a concern but there is no consensus within the Voting Group that the concern requires special input from SC 2, the CCA may advise the Voting Group that it intends to publicly document the concern and the MA decision regarding that concern. (The CCA could consider this necessary, for instance, to avoid reputational harm.) If still there is no consensus within the Voting Group to engage SC 2 on the concern, progression of the CR under normal MA procedures shall resume.</w:t>
       </w:r>
     </w:p>
     <w:p>
@@ -2959,6 +3023,7 @@
         <w:rPr>
           <w:rFonts w:eastAsia="Times New Roman"/>
         </w:rPr>
+        <w:lastRenderedPageBreak/>
         <w:t>A regular newsletter summarizing status and outcomes of CRs.</w:t>
       </w:r>
     </w:p>
@@ -7525,6 +7590,14 @@
     <w:abstractNumId w:val="10"/>
   </w:num>
 </w:numbering>
+</file>
+
+<file path=word/people.xml><?xml version="1.0" encoding="utf-8"?>
+<w15:people xmlns:wpc="http://schemas.microsoft.com/office/word/2010/wordprocessingCanvas" xmlns:cx="http://schemas.microsoft.com/office/drawing/2014/chartex" xmlns:cx1="http://schemas.microsoft.com/office/drawing/2015/9/8/chartex" xmlns:cx2="http://schemas.microsoft.com/office/drawing/2015/10/21/chartex" xmlns:cx3="http://schemas.microsoft.com/office/drawing/2016/5/9/chartex" xmlns:cx4="http://schemas.microsoft.com/office/drawing/2016/5/10/chartex" xmlns:cx5="http://schemas.microsoft.com/office/drawing/2016/5/11/chartex" xmlns:cx6="http://schemas.microsoft.com/office/drawing/2016/5/12/chartex" xmlns:cx7="http://schemas.microsoft.com/office/drawing/2016/5/13/chartex" xmlns:cx8="http://schemas.microsoft.com/office/drawing/2016/5/14/chartex" xmlns:mc="http://schemas.openxmlformats.org/markup-compatibility/2006" xmlns:aink="http://schemas.microsoft.com/office/drawing/2016/ink" xmlns:am3d="http://schemas.microsoft.com/office/drawing/2017/model3d" xmlns:o="urn:schemas-microsoft-com:office:office" xmlns:oel="http://schemas.microsoft.com/office/2019/extlst" xmlns:r="http://schemas.openxmlformats.org/officeDocument/2006/relationships" xmlns:m="http://schemas.openxmlformats.org/officeDocument/2006/math" xmlns:v="urn:schemas-microsoft-com:vml" xmlns:wp14="http://schemas.microsoft.com/office/word/2010/wordprocessingDrawing" xmlns:wp="http://schemas.openxmlformats.org/drawingml/2006/wordprocessingDrawing" xmlns:w10="urn:schemas-microsoft-com:office:word" xmlns:w="http://schemas.openxmlformats.org/wordprocessingml/2006/main" xmlns:w14="http://schemas.microsoft.com/office/word/2010/wordml" xmlns:w15="http://schemas.microsoft.com/office/word/2012/wordml" xmlns:w16cex="http://schemas.microsoft.com/office/word/2018/wordml/cex" xmlns:w16cid="http://schemas.microsoft.com/office/word/2016/wordml/cid" xmlns:w16="http://schemas.microsoft.com/office/word/2018/wordml" xmlns:w16du="http://schemas.microsoft.com/office/word/2023/wordml/word16du" xmlns:w16sdtdh="http://schemas.microsoft.com/office/word/2020/wordml/sdtdatahash" xmlns:w16sdtfl="http://schemas.microsoft.com/office/word/2024/wordml/sdtformatlock" xmlns:w16se="http://schemas.microsoft.com/office/word/2015/wordml/symex" xmlns:wpg="http://schemas.microsoft.com/office/word/2010/wordprocessingGroup" xmlns:wpi="http://schemas.microsoft.com/office/word/2010/wordprocessingInk" xmlns:wne="http://schemas.microsoft.com/office/word/2006/wordml" xmlns:wps="http://schemas.microsoft.com/office/word/2010/wordprocessingShape" mc:Ignorable="w14 w15 w16se w16cid w16 w16cex w16sdtdh w16sdtfl w16du wp14">
+  <w15:person w15:author="Robin Leroy">
+    <w15:presenceInfo w15:providerId="AD" w15:userId="S-1-5-21-3513388644-1422786422-2455105499-1609"/>
+  </w15:person>
+</w15:people>
 </file>
 
 <file path=word/styles.xml><?xml version="1.0" encoding="utf-8"?>
@@ -8521,6 +8594,19 @@
       <w:szCs w:val="22"/>
     </w:rPr>
   </w:style>
+  <w:style w:type="paragraph" w:styleId="Revision">
+    <w:name w:val="Revision"/>
+    <w:hidden/>
+    <w:uiPriority w:val="99"/>
+    <w:semiHidden/>
+    <w:rsid w:val="006A4E9F"/>
+    <w:pPr>
+      <w:spacing w:after="0" w:line="240" w:lineRule="auto"/>
+    </w:pPr>
+    <w:rPr>
+      <w:rFonts w:asciiTheme="majorBidi" w:hAnsiTheme="majorBidi" w:cstheme="majorBidi"/>
+    </w:rPr>
+  </w:style>
 </w:styles>
 </file>
 

</xml_diff>